<commit_message>
Language polish pass on both EJP documents
Wording-only edits at the author's request: tighter parallel structure,
removed throat-clearing and wordplay, de-stacked redundant hedging in
one sentence, replaced a colloquial phrase, removed a redundant
"both because...because" construction. No numbers, abbreviations,
reference numbers, causal language, or statistical wording changed.
Re-verified: no orphan/out-of-range citations, word counts essentially
unchanged (2614/3000, 1296/1500).

Co-Authored-By: Claude Sonnet 5 <noreply@anthropic.com>
Claude-Session: https://claude.ai/code/session_01FRD7etKqYN8v2bbXeeLMRW
</commit_message>
<xml_diff>
--- a/Wandering spleen in children - EJP original article.docx
+++ b/Wandering spleen in children - EJP original article.docx
@@ -231,7 +231,7 @@
           <w:sz w:val="22"/>
           <w:szCs w:val="22"/>
         </w:rPr>
-        <w:t xml:space="preserve">Five children (two girls, three boys; 2.75–13.08 years) accounted for ten institutional encounters. Four had at least one earlier symptomatic episode that did not lead to splenic surgery: in three the family declined the recommended operation and surgery followed a mean of 32 months later, and one had been treated as acute gastritis elsewhere a week before presentation. Four of the five lost the spleen — three to total splenectomy for infarction or necrosis, and one after an initial capsular splenopexy recurred within a month. The child treated by reinforced two-pole fixation retained a viable, normally sited spleen at 13 months. One child had established necrosis despite a normal preoperative platelet count.</w:t>
+        <w:t xml:space="preserve">Five children (two girls, three boys; 2.75–13.08 years) accounted for ten institutional encounters. Four had at least one earlier symptomatic episode that did not lead to splenic surgery: in three, the family declined the recommended operation and surgery followed a mean of 32 months later; in one, an episode a week earlier had been treated elsewhere as acute gastritis. Four of the five lost the spleen — three to total splenectomy for infarction or necrosis, and one after an initial capsular splenopexy recurred within a month. The child treated by reinforced two-pole fixation retained a viable, normally sited spleen at 13 months. One child had established necrosis despite a normal preoperative platelet count.</w:t>
       </w:r>
     </w:p>
     <w:p>
@@ -881,7 +881,7 @@
           <w:sz w:val="22"/>
           <w:szCs w:val="22"/>
         </w:rPr>
-        <w:t xml:space="preserve">The central observation of this series is that splenic loss was associated with delay rather than with any deficiency of technique. Four of five spleens were lost, and in each the definitive operation was preceded by an interval during which the diagnosis was either known and not acted upon or not made at all. In Cases 1 to 3 the diagnosis was established at the first attendance and operation was recommended and declined; the children returned a mean of 32 months later, by which time two had infarcted and the third had a giant, partly infarcted spleen that could no longer be accommodated within a retroperitoneal pouch. In Case 5 the interval was one week rather than years, and the route to that delay was different — diagnostic rather than a deferred decision to operate: an episode of torsion was attributed to acute gastritis elsewhere, and by the time the correct diagnosis was made the spleen had undergone 720° torsion and was necrotic. Only Case 4, operated at his first presentation, retained his spleen, and he came to operation not because the wandering spleen was recognised as an emergency but because he had perforated his stomach.</w:t>
+        <w:t xml:space="preserve">In this series, splenic loss was associated with delay rather than with any deficiency of technique. Four of five spleens were lost, and in each the definitive operation was preceded by an interval during which the diagnosis was either known and not acted upon or not made at all. In Cases 1 to 3 the diagnosis was established at the first attendance and operation was recommended and declined; the children returned a mean of 32 months later, by which time two had infarcted and the third had a giant, partly infarcted spleen that could no longer be accommodated within a retroperitoneal pouch. In Case 5 the interval was one week rather than years, and the route to that delay was different — diagnostic rather than a deferred decision to operate: an episode of torsion was attributed to acute gastritis elsewhere, and by the time the correct diagnosis was made the spleen had undergone 720° torsion and was necrotic. Only Case 4, operated at his first presentation, retained his spleen, and he came to operation not because the wandering spleen was recognised as an emergency but because he had perforated his stomach.</w:t>
       </w:r>
     </w:p>
     <w:p>
@@ -895,7 +895,7 @@
           <w:sz w:val="22"/>
           <w:szCs w:val="22"/>
         </w:rPr>
-        <w:t xml:space="preserve">This bears directly on the management of the child whose symptoms have settled. Conservative management is superficially attractive because the pain resolves: in this series it resolved on every occasion it was treated non-operatively, within five to seven days. That resolution is not evidence of a resolved problem. It reflects spontaneous detorsion, and the ligamentous deficiency that permitted the torsion is unchanged. The natural history in these children was of recurrent episodes culminating in infarction. Our findings therefore support splenopexy once the diagnosis is made, including in the child who is asymptomatic at the time, a position also reflected in larger multicentre and pooled-review experience [3, 12].</w:t>
+        <w:t xml:space="preserve">This bears directly on the management of the child whose symptoms have settled. Conservative management is superficially attractive because the pain resolves: in this series it resolved on every occasion it was treated non-operatively, within five to seven days. This does not indicate that the underlying problem has resolved. It reflects spontaneous detorsion, and the ligamentous deficiency that permitted the torsion is unchanged. The natural history in these children was of recurrent episodes culminating in infarction. Our findings therefore support splenopexy once the diagnosis is made, including in the child who is asymptomatic at the time, a position also reflected in larger multicentre and pooled-review experience [3, 12].</w:t>
       </w:r>
     </w:p>
     <w:p>
@@ -909,7 +909,7 @@
           <w:sz w:val="22"/>
           <w:szCs w:val="22"/>
         </w:rPr>
-        <w:t xml:space="preserve">A corollary concerns the platelet count. Reactive thrombocytosis has been reported as a preoperative predictor of splenic infarction in children with splenic torsion [15], and our first two cases conformed: both had counts above 400 × 10⁹/L before splenectomy, and counts were normal at every encounter at which the spleen was viable. Case 5 did not conform. He had established necrosis after only 18 hours of symptoms, with a normal platelet count. We hypothesize that the explanation is temporal: reactive thrombocytosis is thought to require a period of functional asplenia long enough for the marrow to respond, and therefore may mark a subacute or chronic course rather than infarction itself, whereas in hyperacute torsion such an interval has not yet elapsed. A normal platelet count should not be used to exclude infarction or necrosis in a child with suspected torsion, and where the presentation is acute, imaging rather than haematology must decide. In that setting the whirl sign, the spiral of the twisted splenic vessels, was sufficient to establish the diagnosis on a non-contrast study in Case 5 and is worth seeking specifically [16].</w:t>
+        <w:t xml:space="preserve">A corollary concerns the platelet count. Reactive thrombocytosis has been reported as a preoperative predictor of splenic infarction in children with splenic torsion [15], and our first two cases conformed: both had counts above 400 × 10⁹/L before splenectomy, and counts were normal at every encounter at which the spleen was viable. Case 5 did not conform. He had established necrosis after only 18 hours of symptoms, with a normal platelet count. We hypothesize that the explanation is temporal: reactive thrombocytosis requires a period of functional asplenia long enough for the marrow to respond, and therefore marks a subacute or chronic course rather than infarction itself, whereas in hyperacute torsion such an interval has not yet elapsed. A normal platelet count should not be used to exclude infarction or necrosis in a child with suspected torsion, and where the presentation is acute, imaging rather than haematology must decide. In that setting the whirl sign, the spiral of the twisted splenic vessels, was sufficient to establish the diagnosis on a non-contrast study in Case 5 and should be sought specifically [16].</w:t>
       </w:r>
     </w:p>
     <w:p>
@@ -923,7 +923,7 @@
           <w:sz w:val="22"/>
           <w:szCs w:val="22"/>
         </w:rPr>
-        <w:t xml:space="preserve">The second question concerns fixation. Mesh splenopexy, in which the spleen is wrapped in absorbable or synthetic mesh anchored to the diaphragm or peritoneum, is well described and effective in appropriately sized spleens, but becomes difficult when the spleen is enlarged, both because the spleen cannot be enclosed and because laparoscopic working space is limited; synthetic material also carries risks of infection and foreign-body reaction [11, 12, 17]. Construction of a retroperitoneal or subperitoneal pouch, by balloon dilatation, saline injection or blunt dissection, is the other widely used approach [13, 18-20]. It too depends on the spleen fitting, and compression within a pouch that is too small has been reported to cause ischaemia and infarction. Where the pouch cannot be made large enough, surgeons have resorted to splenectomy, as illustrated by Case 3 below.</w:t>
+        <w:t xml:space="preserve">The second question concerns fixation. Mesh splenopexy, in which the spleen is wrapped in absorbable or synthetic mesh anchored to the diaphragm or peritoneum, is well described and effective in appropriately sized spleens, but becomes difficult when the spleen is enlarged, because the spleen cannot be enclosed and laparoscopic working space is limited; synthetic material also carries risks of infection and foreign-body reaction [11, 12, 17]. Construction of a retroperitoneal or subperitoneal pouch, by balloon dilatation, saline injection or blunt dissection, is the other widely used approach [13, 18-20]. It too depends on the spleen fitting, and compression within a pouch that is too small has been reported to cause ischaemia and infarction. Where the pouch cannot be made large enough, surgeons have resorted to splenectomy, as illustrated by Case 3 below.</w:t>
       </w:r>
     </w:p>
     <w:p>

</xml_diff>